<commit_message>
Documentos de analisis de competencia y tecnologías añadidos
</commit_message>
<xml_diff>
--- a/Documentos/AnalisisCompetencia.docx
+++ b/Documentos/AnalisisCompetencia.docx
@@ -4,29 +4,82 @@
   <w:body>
     <w:p>
       <w:pPr>
+        <w:pStyle w:val="Ttulo"/>
+      </w:pPr>
+      <w:r>
+        <w:t>Herramientas de búsqueda de piso más populares en España</w:t>
+      </w:r>
+    </w:p>
+    <w:p>
+      <w:pPr>
         <w:pStyle w:val="Ttulo1"/>
+      </w:pPr>
+      <w:r>
+        <w:t>Portales generales</w:t>
+      </w:r>
+    </w:p>
+    <w:p>
+      <w:pPr>
+        <w:pStyle w:val="Ttulo2"/>
+      </w:pPr>
+      <w:r>
+        <w:t>Idealista</w:t>
+      </w:r>
+    </w:p>
+    <w:p>
+      <w:pPr>
         <w:jc w:val="both"/>
       </w:pPr>
       <w:r>
-        <w:t>Herramientas de búsqueda de piso más populares en España</w:t>
+        <w:t>Página web/aplicación donde se publican todo tipo de alquileres/ventas de viviendas. No hay control sobre los anuncios, se pueden publicar desde anuncios bien documentados y con amplia información de la vivienda, hasta anuncios con pocas o ninguna imagen útil.</w:t>
+      </w:r>
+    </w:p>
+    <w:p>
+      <w:pPr>
+        <w:jc w:val="both"/>
+      </w:pPr>
+      <w:r>
+        <w:t>Es el portal más usado en España, con una amplia base de datos, posibilidad de dibujar una zona de búsqueda sobre el mapa, además de contar con filtros avanzados.</w:t>
       </w:r>
     </w:p>
     <w:p>
       <w:pPr>
         <w:pStyle w:val="Ttulo2"/>
+      </w:pPr>
+      <w:r>
+        <w:t>Fotocasa</w:t>
+      </w:r>
+    </w:p>
+    <w:p>
+      <w:pPr>
         <w:jc w:val="both"/>
       </w:pPr>
       <w:r>
-        <w:t>Portales generales</w:t>
-      </w:r>
-    </w:p>
-    <w:p>
-      <w:pPr>
-        <w:pStyle w:val="Ttulo3"/>
+        <w:t xml:space="preserve">La alternativa a Idealista, funciona de manera muy similar, aunque incluyendo herramientas visuales muy interesantes, como tours 3D por la vivienda. </w:t>
+      </w:r>
+    </w:p>
+    <w:p>
+      <w:pPr>
+        <w:pStyle w:val="Ttulo2"/>
+      </w:pPr>
+      <w:r>
+        <w:t>Habitaclia</w:t>
+      </w:r>
+    </w:p>
+    <w:p>
+      <w:pPr>
         <w:jc w:val="both"/>
       </w:pPr>
       <w:r>
-        <w:t>Idealista</w:t>
+        <w:t>Especialmente popular en la zona de Cataluña, aunque con anuncios por toda España. Oferta de todo tipo de inmuebles y búsqueda visual por zonas y barrios dentro de las ciudades.</w:t>
+      </w:r>
+    </w:p>
+    <w:p>
+      <w:pPr>
+        <w:pStyle w:val="Ttulo2"/>
+      </w:pPr>
+      <w:r>
+        <w:t>Pisos.com</w:t>
       </w:r>
     </w:p>
     <w:p>
@@ -34,7 +87,15 @@
         <w:jc w:val="both"/>
       </w:pPr>
       <w:r>
-        <w:t>Página web/aplicación donde se publican todo tipo de alquileres/ventas de viviendas. No hay control sobre los anuncios, se pueden publicar desde anuncios bien documentados y con amplia información de la vivienda, hasta anuncios con pocas o ninguna imagen útil.</w:t>
+        <w:t>Portal clásico, forma de búsqueda similar a la anterior.</w:t>
+      </w:r>
+    </w:p>
+    <w:p>
+      <w:pPr>
+        <w:pStyle w:val="Ttulo2"/>
+      </w:pPr>
+      <w:r>
+        <w:t>YaEncontre</w:t>
       </w:r>
     </w:p>
     <w:p>
@@ -42,16 +103,37 @@
         <w:jc w:val="both"/>
       </w:pPr>
       <w:r>
-        <w:t>Es el portal más usado en España, con una amplia base de datos, posibilidad de dibujar una zona de búsqueda sobre el mapa, además de contar con filtros avanzados.</w:t>
-      </w:r>
-    </w:p>
-    <w:p>
-      <w:pPr>
-        <w:pStyle w:val="Ttulo3"/>
+        <w:t>Muy similar a las anteriores, nada que destacar por encima de ellas.</w:t>
+      </w:r>
+    </w:p>
+    <w:p>
+      <w:pPr>
+        <w:pStyle w:val="Ttulo1"/>
+      </w:pPr>
+      <w:r>
+        <w:t>Aplicaciones</w:t>
+      </w:r>
+    </w:p>
+    <w:p>
+      <w:pPr>
+        <w:pStyle w:val="Ttulo2"/>
+      </w:pPr>
+      <w:r>
+        <w:t>Badi</w:t>
+      </w:r>
+    </w:p>
+    <w:p>
+      <w:pPr>
         <w:jc w:val="both"/>
       </w:pPr>
       <w:r>
-        <w:t>Fotocasa</w:t>
+        <w:t>Aplicación para buscar habitación en pisos compartidos. Funciona a modo de “red social”, trata</w:t>
+      </w:r>
+      <w:r>
+        <w:t>n</w:t>
+      </w:r>
+      <w:r>
+        <w:t>do de asegurar afinidad entre compañeros.</w:t>
       </w:r>
     </w:p>
     <w:p>
@@ -59,234 +141,118 @@
         <w:jc w:val="both"/>
       </w:pPr>
       <w:r>
-        <w:t xml:space="preserve">La alternativa a </w:t>
-      </w:r>
-      <w:proofErr w:type="gramStart"/>
-      <w:r>
-        <w:t>Idealista,</w:t>
-      </w:r>
-      <w:proofErr w:type="gramEnd"/>
-      <w:r>
-        <w:t xml:space="preserve"> funciona de manera muy similar, aunque incluyendo herramientas visuales muy interesantes, como tours 3D por la vivienda. </w:t>
-      </w:r>
-    </w:p>
-    <w:p>
-      <w:pPr>
-        <w:pStyle w:val="Ttulo3"/>
+        <w:lastRenderedPageBreak/>
+        <w:t>Servicio Badi plus, donde se muestran habitaciones preparadas para entrar en zonas seleccionadas en barrios concretos, con el fin de ofrecer un servicio especial y más exclusivo.</w:t>
+      </w:r>
+    </w:p>
+    <w:p>
+      <w:pPr>
+        <w:pStyle w:val="Ttulo2"/>
+      </w:pPr>
+      <w:r>
+        <w:t>Spotahome</w:t>
+      </w:r>
+    </w:p>
+    <w:p>
+      <w:pPr>
         <w:jc w:val="both"/>
       </w:pPr>
-      <w:proofErr w:type="spellStart"/>
-      <w:r>
-        <w:t>Habitaclia</w:t>
-      </w:r>
-      <w:proofErr w:type="spellEnd"/>
+      <w:r>
+        <w:t>Aplicación de búsqueda de piso por toda Europa, contando con más de 800 ciudades, su principal objetivo es facilitar la búsqueda de piso para larga duración para aquella gente que se mueva a otras ciudades, donde no conoce gente.</w:t>
+      </w:r>
+      <w:r>
+        <w:t xml:space="preserve"> Viviendas verificadas, pero sin visitas físicas.</w:t>
+      </w:r>
+    </w:p>
+    <w:p>
+      <w:pPr>
+        <w:pStyle w:val="Ttulo2"/>
+      </w:pPr>
+      <w:r>
+        <w:t>Housfy</w:t>
+      </w:r>
     </w:p>
     <w:p>
       <w:pPr>
         <w:jc w:val="both"/>
       </w:pPr>
       <w:r>
-        <w:t>Especialmente popular en la zona de Cataluña, aunque con anuncios por toda España. Oferta de todo tipo de inmuebles y búsqueda visual por zonas y barrios dentro de las ciudades.</w:t>
-      </w:r>
-    </w:p>
-    <w:p>
-      <w:pPr>
-        <w:pStyle w:val="Ttulo3"/>
+        <w:t>Inmobiliaria digital que permite vender o alquilar viviendas contactando directamente con el propietario.</w:t>
+      </w:r>
+    </w:p>
+    <w:p>
+      <w:pPr>
+        <w:pStyle w:val="Ttulo2"/>
+      </w:pPr>
+      <w:r>
+        <w:t>Uniplaces</w:t>
+      </w:r>
+    </w:p>
+    <w:p>
+      <w:pPr>
         <w:jc w:val="both"/>
       </w:pPr>
       <w:r>
-        <w:t>Pisos.com</w:t>
-      </w:r>
-    </w:p>
-    <w:p>
-      <w:r>
-        <w:t>Portal clásico, forma de búsqueda similar a la anterior.</w:t>
-      </w:r>
-    </w:p>
-    <w:p>
-      <w:pPr>
-        <w:pStyle w:val="Ttulo3"/>
+        <w:t>Popular entre estudiantes internacionales y jóvenes profesionales para alquileres temporales.</w:t>
+      </w:r>
+    </w:p>
+    <w:p>
+      <w:pPr>
+        <w:pStyle w:val="Ttulo1"/>
+      </w:pPr>
+      <w:r>
+        <w:t>Inmobiliarias</w:t>
+      </w:r>
+    </w:p>
+    <w:p>
+      <w:pPr>
+        <w:pStyle w:val="Ttulo2"/>
+      </w:pPr>
+      <w:r>
+        <w:t>Tecnocasa</w:t>
+      </w:r>
+    </w:p>
+    <w:p>
+      <w:pPr>
         <w:jc w:val="both"/>
       </w:pPr>
-      <w:proofErr w:type="spellStart"/>
-      <w:r>
-        <w:t>YaEncontre</w:t>
-      </w:r>
-      <w:proofErr w:type="spellEnd"/>
-    </w:p>
-    <w:p>
-      <w:r>
-        <w:t>Muy similar a las anteriores, nada que destacar por encima de ellas.</w:t>
+      <w:r>
+        <w:t>Probablemente es la inmobiliaria más popular de toda España, contando con oficinas físicas en casi todos los barrios de las ciudades</w:t>
+      </w:r>
+      <w:r>
+        <w:t>. Cobra comisiones que a veces pueden ser demasiado altas.</w:t>
       </w:r>
     </w:p>
     <w:p>
       <w:pPr>
         <w:pStyle w:val="Ttulo2"/>
+      </w:pPr>
+      <w:r>
+        <w:t>Redpiso</w:t>
+      </w:r>
+    </w:p>
+    <w:p>
+      <w:pPr>
         <w:jc w:val="both"/>
       </w:pPr>
       <w:r>
-        <w:t>Aplicaciones</w:t>
-      </w:r>
-    </w:p>
-    <w:p>
-      <w:pPr>
-        <w:pStyle w:val="Ttulo3"/>
+        <w:t>Inmobiliaria popular principalmente en las grandes ciudades y capitales. Tienen un sistema de financiación propio.</w:t>
+      </w:r>
+    </w:p>
+    <w:p>
+      <w:pPr>
         <w:jc w:val="both"/>
       </w:pPr>
-      <w:proofErr w:type="spellStart"/>
-      <w:r>
-        <w:t>Badi</w:t>
-      </w:r>
-      <w:proofErr w:type="spellEnd"/>
-    </w:p>
-    <w:p>
-      <w:r>
-        <w:t xml:space="preserve">Aplicación para buscar habitación en pisos compartidos. Funciona a modo de “red social”, </w:t>
-      </w:r>
-      <w:proofErr w:type="spellStart"/>
-      <w:r>
-        <w:t>tratabdo</w:t>
-      </w:r>
-      <w:proofErr w:type="spellEnd"/>
-      <w:r>
-        <w:t xml:space="preserve"> de asegurar afinidad entre compañeros.</w:t>
-      </w:r>
-    </w:p>
-    <w:p>
-      <w:pPr>
-        <w:pStyle w:val="Ttulo3"/>
-      </w:pPr>
-      <w:proofErr w:type="spellStart"/>
-      <w:r>
-        <w:t>Spotahome</w:t>
-      </w:r>
-      <w:proofErr w:type="spellEnd"/>
-    </w:p>
-    <w:p>
-      <w:r>
-        <w:t xml:space="preserve">Aplicación de búsqueda de piso por toda Europa, contando con más de 800 ciudades, su principal objetivo es facilitar la búsqueda de piso para larga duración </w:t>
-      </w:r>
-      <w:r>
-        <w:lastRenderedPageBreak/>
-        <w:t>para aquella gente que se mueva a otras ciudades, donde no conoce gente.</w:t>
-      </w:r>
-      <w:r>
-        <w:t xml:space="preserve"> Viviendas verificadas, pero sin visitas físicas.</w:t>
-      </w:r>
-    </w:p>
-    <w:p>
-      <w:pPr>
-        <w:pStyle w:val="Ttulo3"/>
-        <w:jc w:val="both"/>
-      </w:pPr>
-      <w:proofErr w:type="spellStart"/>
-      <w:r>
-        <w:t>Housfy</w:t>
-      </w:r>
-      <w:proofErr w:type="spellEnd"/>
-    </w:p>
-    <w:p>
-      <w:r>
-        <w:t>Inmobiliaria digital que permite vender o alquilar viviendas contactando directamente con el propietario.</w:t>
-      </w:r>
-    </w:p>
-    <w:p>
-      <w:pPr>
-        <w:pStyle w:val="Ttulo3"/>
-        <w:jc w:val="both"/>
-      </w:pPr>
-      <w:proofErr w:type="spellStart"/>
-      <w:r>
-        <w:t>Uniplaces</w:t>
-      </w:r>
-      <w:proofErr w:type="spellEnd"/>
-    </w:p>
-    <w:p>
-      <w:r>
-        <w:t>Popular entre estudiantes internacionales y jóvenes profesionales para alquileres temporales.</w:t>
-      </w:r>
-    </w:p>
-    <w:p>
-      <w:pPr>
-        <w:pStyle w:val="Ttulo2"/>
-        <w:jc w:val="both"/>
-      </w:pPr>
-      <w:r>
-        <w:t>Inmobiliarias</w:t>
-      </w:r>
-    </w:p>
-    <w:p>
-      <w:pPr>
-        <w:pStyle w:val="Ttulo3"/>
-        <w:jc w:val="both"/>
-      </w:pPr>
-      <w:r>
-        <w:t>Tecnocasa</w:t>
-      </w:r>
-    </w:p>
-    <w:p>
-      <w:r>
-        <w:t>Probablemente es la inmobiliaria más popular de toda España, contando con oficinas físicas en casi todos los barrios de las ciudades</w:t>
-      </w:r>
-      <w:r>
-        <w:t>. Cobra comisiones que a veces pueden ser demasiado altas.</w:t>
-      </w:r>
-    </w:p>
-    <w:p>
-      <w:pPr>
-        <w:pStyle w:val="Ttulo3"/>
-        <w:jc w:val="both"/>
-      </w:pPr>
-      <w:proofErr w:type="spellStart"/>
-      <w:r>
-        <w:t>Redpiso</w:t>
-      </w:r>
-      <w:proofErr w:type="spellEnd"/>
-    </w:p>
-    <w:p>
-      <w:r>
-        <w:t>Inmobiliaria popular principalmente en las grandes ciudades y capitales. Tienen un sistema de financiación propio.</w:t>
+    </w:p>
+    <w:p>
+      <w:pPr>
+        <w:pStyle w:val="Ttulo1"/>
+      </w:pPr>
+      <w:r>
+        <w:t>Tabla comparativa de las diferentes herramientas</w:t>
       </w:r>
     </w:p>
     <w:p/>
-    <w:p>
-      <w:pPr>
-        <w:pStyle w:val="Ttulo2"/>
-      </w:pPr>
-      <w:r>
-        <w:t>Tabla comparativa de las diferentes herramientas</w:t>
-      </w:r>
-    </w:p>
-    <w:p>
-      <w:r>
-        <w:t>Nombre</w:t>
-      </w:r>
-    </w:p>
-    <w:p>
-      <w:r>
-        <w:t>Uso principal</w:t>
-      </w:r>
-    </w:p>
-    <w:p>
-      <w:r>
-        <w:t>Punto fuerte</w:t>
-      </w:r>
-    </w:p>
-    <w:p>
-      <w:r>
-        <w:t>Nivel de uso</w:t>
-      </w:r>
-    </w:p>
-    <w:p>
-      <w:r>
-        <w:t>Búsqueda</w:t>
-      </w:r>
-    </w:p>
-    <w:p>
-      <w:r>
-        <w:t>Requisitos de anuncios</w:t>
-      </w:r>
-    </w:p>
     <w:tbl>
       <w:tblPr>
         <w:tblStyle w:val="Tablaconcuadrcula"/>
@@ -294,17 +260,16 @@
         <w:tblLook w:val="04A0" w:firstRow="1" w:lastRow="0" w:firstColumn="1" w:lastColumn="0" w:noHBand="0" w:noVBand="1"/>
       </w:tblPr>
       <w:tblGrid>
-        <w:gridCol w:w="1545"/>
-        <w:gridCol w:w="1648"/>
-        <w:gridCol w:w="1536"/>
-        <w:gridCol w:w="1596"/>
-        <w:gridCol w:w="1336"/>
-        <w:gridCol w:w="833"/>
+        <w:gridCol w:w="1595"/>
+        <w:gridCol w:w="1703"/>
+        <w:gridCol w:w="1762"/>
+        <w:gridCol w:w="1649"/>
+        <w:gridCol w:w="857"/>
       </w:tblGrid>
       <w:tr>
         <w:tc>
           <w:tcPr>
-            <w:tcW w:w="1545" w:type="dxa"/>
+            <w:tcW w:w="1595" w:type="dxa"/>
           </w:tcPr>
           <w:p>
             <w:pPr>
@@ -324,7 +289,7 @@
         </w:tc>
         <w:tc>
           <w:tcPr>
-            <w:tcW w:w="1648" w:type="dxa"/>
+            <w:tcW w:w="1703" w:type="dxa"/>
           </w:tcPr>
           <w:p>
             <w:pPr>
@@ -344,7 +309,7 @@
         </w:tc>
         <w:tc>
           <w:tcPr>
-            <w:tcW w:w="1536" w:type="dxa"/>
+            <w:tcW w:w="1587" w:type="dxa"/>
           </w:tcPr>
           <w:p>
             <w:pPr>
@@ -364,7 +329,7 @@
         </w:tc>
         <w:tc>
           <w:tcPr>
-            <w:tcW w:w="1596" w:type="dxa"/>
+            <w:tcW w:w="1649" w:type="dxa"/>
           </w:tcPr>
           <w:p>
             <w:pPr>
@@ -384,7 +349,7 @@
         </w:tc>
         <w:tc>
           <w:tcPr>
-            <w:tcW w:w="1336" w:type="dxa"/>
+            <w:tcW w:w="857" w:type="dxa"/>
           </w:tcPr>
           <w:p>
             <w:pPr>
@@ -398,26 +363,6 @@
                 <w:b/>
                 <w:bCs/>
               </w:rPr>
-              <w:t>Requisitos de anuncios</w:t>
-            </w:r>
-          </w:p>
-        </w:tc>
-        <w:tc>
-          <w:tcPr>
-            <w:tcW w:w="833" w:type="dxa"/>
-          </w:tcPr>
-          <w:p>
-            <w:pPr>
-              <w:rPr>
-                <w:b/>
-                <w:bCs/>
-              </w:rPr>
-            </w:pPr>
-            <w:r>
-              <w:rPr>
-                <w:b/>
-                <w:bCs/>
-              </w:rPr>
               <w:t>Nivel de uso</w:t>
             </w:r>
           </w:p>
@@ -426,7 +371,7 @@
       <w:tr>
         <w:tc>
           <w:tcPr>
-            <w:tcW w:w="1545" w:type="dxa"/>
+            <w:tcW w:w="1595" w:type="dxa"/>
           </w:tcPr>
           <w:p>
             <w:r>
@@ -436,7 +381,7 @@
         </w:tc>
         <w:tc>
           <w:tcPr>
-            <w:tcW w:w="1648" w:type="dxa"/>
+            <w:tcW w:w="1703" w:type="dxa"/>
           </w:tcPr>
           <w:p>
             <w:r>
@@ -446,7 +391,7 @@
         </w:tc>
         <w:tc>
           <w:tcPr>
-            <w:tcW w:w="1536" w:type="dxa"/>
+            <w:tcW w:w="1587" w:type="dxa"/>
           </w:tcPr>
           <w:p>
             <w:r>
@@ -456,30 +401,25 @@
         </w:tc>
         <w:tc>
           <w:tcPr>
-            <w:tcW w:w="1596" w:type="dxa"/>
-          </w:tcPr>
-          <w:p>
-            <w:r>
-              <w:t>Convencional y área 3D dibujada sobre el mapa</w:t>
-            </w:r>
-          </w:p>
-        </w:tc>
-        <w:tc>
-          <w:tcPr>
-            <w:tcW w:w="1336" w:type="dxa"/>
-          </w:tcPr>
-          <w:p>
-            <w:r>
-              <w:t>Ninguno</w:t>
-            </w:r>
-          </w:p>
-        </w:tc>
-        <w:tc>
-          <w:tcPr>
-            <w:tcW w:w="833" w:type="dxa"/>
-          </w:tcPr>
-          <w:p>
-            <w:r>
+            <w:tcW w:w="1649" w:type="dxa"/>
+          </w:tcPr>
+          <w:p>
+            <w:r>
+              <w:t xml:space="preserve">Convencional y área 3D dibujada </w:t>
+            </w:r>
+            <w:r>
+              <w:lastRenderedPageBreak/>
+              <w:t>sobre el mapa</w:t>
+            </w:r>
+          </w:p>
+        </w:tc>
+        <w:tc>
+          <w:tcPr>
+            <w:tcW w:w="857" w:type="dxa"/>
+          </w:tcPr>
+          <w:p>
+            <w:r>
+              <w:lastRenderedPageBreak/>
               <w:t>Muy alto</w:t>
             </w:r>
           </w:p>
@@ -488,18 +428,17 @@
       <w:tr>
         <w:tc>
           <w:tcPr>
-            <w:tcW w:w="1545" w:type="dxa"/>
-          </w:tcPr>
-          <w:p>
-            <w:r>
-              <w:lastRenderedPageBreak/>
+            <w:tcW w:w="1595" w:type="dxa"/>
+          </w:tcPr>
+          <w:p>
+            <w:r>
               <w:t xml:space="preserve">Fotocasa </w:t>
             </w:r>
           </w:p>
         </w:tc>
         <w:tc>
           <w:tcPr>
-            <w:tcW w:w="1648" w:type="dxa"/>
+            <w:tcW w:w="1703" w:type="dxa"/>
           </w:tcPr>
           <w:p>
             <w:r>
@@ -509,7 +448,7 @@
         </w:tc>
         <w:tc>
           <w:tcPr>
-            <w:tcW w:w="1536" w:type="dxa"/>
+            <w:tcW w:w="1587" w:type="dxa"/>
           </w:tcPr>
           <w:p>
             <w:r>
@@ -519,7 +458,7 @@
         </w:tc>
         <w:tc>
           <w:tcPr>
-            <w:tcW w:w="1596" w:type="dxa"/>
+            <w:tcW w:w="1649" w:type="dxa"/>
           </w:tcPr>
           <w:p>
             <w:r>
@@ -529,17 +468,7 @@
         </w:tc>
         <w:tc>
           <w:tcPr>
-            <w:tcW w:w="1336" w:type="dxa"/>
-          </w:tcPr>
-          <w:p>
-            <w:r>
-              <w:t>Ninguno</w:t>
-            </w:r>
-          </w:p>
-        </w:tc>
-        <w:tc>
-          <w:tcPr>
-            <w:tcW w:w="833" w:type="dxa"/>
+            <w:tcW w:w="857" w:type="dxa"/>
           </w:tcPr>
           <w:p>
             <w:r>
@@ -551,19 +480,17 @@
       <w:tr>
         <w:tc>
           <w:tcPr>
-            <w:tcW w:w="1545" w:type="dxa"/>
-          </w:tcPr>
-          <w:p>
-            <w:proofErr w:type="spellStart"/>
+            <w:tcW w:w="1595" w:type="dxa"/>
+          </w:tcPr>
+          <w:p>
             <w:r>
               <w:t>Habitaclia</w:t>
             </w:r>
-            <w:proofErr w:type="spellEnd"/>
-          </w:p>
-        </w:tc>
-        <w:tc>
-          <w:tcPr>
-            <w:tcW w:w="1648" w:type="dxa"/>
+          </w:p>
+        </w:tc>
+        <w:tc>
+          <w:tcPr>
+            <w:tcW w:w="1703" w:type="dxa"/>
           </w:tcPr>
           <w:p>
             <w:r>
@@ -573,7 +500,7 @@
         </w:tc>
         <w:tc>
           <w:tcPr>
-            <w:tcW w:w="1536" w:type="dxa"/>
+            <w:tcW w:w="1587" w:type="dxa"/>
           </w:tcPr>
           <w:p>
             <w:r>
@@ -583,7 +510,7 @@
         </w:tc>
         <w:tc>
           <w:tcPr>
-            <w:tcW w:w="1596" w:type="dxa"/>
+            <w:tcW w:w="1649" w:type="dxa"/>
           </w:tcPr>
           <w:p>
             <w:r>
@@ -593,17 +520,7 @@
         </w:tc>
         <w:tc>
           <w:tcPr>
-            <w:tcW w:w="1336" w:type="dxa"/>
-          </w:tcPr>
-          <w:p>
-            <w:r>
-              <w:t xml:space="preserve">Ninguno </w:t>
-            </w:r>
-          </w:p>
-        </w:tc>
-        <w:tc>
-          <w:tcPr>
-            <w:tcW w:w="833" w:type="dxa"/>
+            <w:tcW w:w="857" w:type="dxa"/>
           </w:tcPr>
           <w:p>
             <w:r>
@@ -615,7 +532,7 @@
       <w:tr>
         <w:tc>
           <w:tcPr>
-            <w:tcW w:w="1545" w:type="dxa"/>
+            <w:tcW w:w="1595" w:type="dxa"/>
           </w:tcPr>
           <w:p>
             <w:r>
@@ -625,7 +542,7 @@
         </w:tc>
         <w:tc>
           <w:tcPr>
-            <w:tcW w:w="1648" w:type="dxa"/>
+            <w:tcW w:w="1703" w:type="dxa"/>
           </w:tcPr>
           <w:p>
             <w:r>
@@ -635,7 +552,7 @@
         </w:tc>
         <w:tc>
           <w:tcPr>
-            <w:tcW w:w="1536" w:type="dxa"/>
+            <w:tcW w:w="1587" w:type="dxa"/>
           </w:tcPr>
           <w:p>
             <w:r>
@@ -645,7 +562,7 @@
         </w:tc>
         <w:tc>
           <w:tcPr>
-            <w:tcW w:w="1596" w:type="dxa"/>
+            <w:tcW w:w="1649" w:type="dxa"/>
           </w:tcPr>
           <w:p>
             <w:r>
@@ -655,17 +572,7 @@
         </w:tc>
         <w:tc>
           <w:tcPr>
-            <w:tcW w:w="1336" w:type="dxa"/>
-          </w:tcPr>
-          <w:p>
-            <w:r>
-              <w:t>Ninguno</w:t>
-            </w:r>
-          </w:p>
-        </w:tc>
-        <w:tc>
-          <w:tcPr>
-            <w:tcW w:w="833" w:type="dxa"/>
+            <w:tcW w:w="857" w:type="dxa"/>
           </w:tcPr>
           <w:p>
             <w:r>
@@ -677,19 +584,17 @@
       <w:tr>
         <w:tc>
           <w:tcPr>
-            <w:tcW w:w="1545" w:type="dxa"/>
-          </w:tcPr>
-          <w:p>
-            <w:proofErr w:type="spellStart"/>
+            <w:tcW w:w="1595" w:type="dxa"/>
+          </w:tcPr>
+          <w:p>
             <w:r>
               <w:t>Yaencontre</w:t>
             </w:r>
-            <w:proofErr w:type="spellEnd"/>
-          </w:p>
-        </w:tc>
-        <w:tc>
-          <w:tcPr>
-            <w:tcW w:w="1648" w:type="dxa"/>
+          </w:p>
+        </w:tc>
+        <w:tc>
+          <w:tcPr>
+            <w:tcW w:w="1703" w:type="dxa"/>
           </w:tcPr>
           <w:p>
             <w:r>
@@ -699,13 +604,17 @@
         </w:tc>
         <w:tc>
           <w:tcPr>
-            <w:tcW w:w="1536" w:type="dxa"/>
-          </w:tcPr>
-          <w:p/>
-        </w:tc>
-        <w:tc>
-          <w:tcPr>
-            <w:tcW w:w="1596" w:type="dxa"/>
+            <w:tcW w:w="1587" w:type="dxa"/>
+          </w:tcPr>
+          <w:p>
+            <w:r>
+              <w:t>Alternativa a las más conocidas</w:t>
+            </w:r>
+          </w:p>
+        </w:tc>
+        <w:tc>
+          <w:tcPr>
+            <w:tcW w:w="1649" w:type="dxa"/>
           </w:tcPr>
           <w:p>
             <w:r>
@@ -715,17 +624,7 @@
         </w:tc>
         <w:tc>
           <w:tcPr>
-            <w:tcW w:w="1336" w:type="dxa"/>
-          </w:tcPr>
-          <w:p>
-            <w:r>
-              <w:t>Ninguno</w:t>
-            </w:r>
-          </w:p>
-        </w:tc>
-        <w:tc>
-          <w:tcPr>
-            <w:tcW w:w="833" w:type="dxa"/>
+            <w:tcW w:w="857" w:type="dxa"/>
           </w:tcPr>
           <w:p>
             <w:r>
@@ -737,19 +636,17 @@
       <w:tr>
         <w:tc>
           <w:tcPr>
-            <w:tcW w:w="1545" w:type="dxa"/>
-          </w:tcPr>
-          <w:p>
-            <w:proofErr w:type="spellStart"/>
+            <w:tcW w:w="1595" w:type="dxa"/>
+          </w:tcPr>
+          <w:p>
             <w:r>
               <w:t>Badi</w:t>
             </w:r>
-            <w:proofErr w:type="spellEnd"/>
-          </w:p>
-        </w:tc>
-        <w:tc>
-          <w:tcPr>
-            <w:tcW w:w="1648" w:type="dxa"/>
+          </w:p>
+        </w:tc>
+        <w:tc>
+          <w:tcPr>
+            <w:tcW w:w="1703" w:type="dxa"/>
           </w:tcPr>
           <w:p>
             <w:r>
@@ -759,7 +656,7 @@
         </w:tc>
         <w:tc>
           <w:tcPr>
-            <w:tcW w:w="1536" w:type="dxa"/>
+            <w:tcW w:w="1587" w:type="dxa"/>
           </w:tcPr>
           <w:p>
             <w:r>
@@ -769,23 +666,17 @@
         </w:tc>
         <w:tc>
           <w:tcPr>
-            <w:tcW w:w="1596" w:type="dxa"/>
-          </w:tcPr>
-          <w:p/>
-        </w:tc>
-        <w:tc>
-          <w:tcPr>
-            <w:tcW w:w="1336" w:type="dxa"/>
-          </w:tcPr>
-          <w:p>
-            <w:r>
-              <w:t>Ninguno (?)</w:t>
-            </w:r>
-          </w:p>
-        </w:tc>
-        <w:tc>
-          <w:tcPr>
-            <w:tcW w:w="833" w:type="dxa"/>
+            <w:tcW w:w="1649" w:type="dxa"/>
+          </w:tcPr>
+          <w:p>
+            <w:r>
+              <w:t>Convencional y mediante Badi plus</w:t>
+            </w:r>
+          </w:p>
+        </w:tc>
+        <w:tc>
+          <w:tcPr>
+            <w:tcW w:w="857" w:type="dxa"/>
           </w:tcPr>
           <w:p>
             <w:r>
@@ -797,19 +688,17 @@
       <w:tr>
         <w:tc>
           <w:tcPr>
-            <w:tcW w:w="1545" w:type="dxa"/>
-          </w:tcPr>
-          <w:p>
-            <w:proofErr w:type="spellStart"/>
+            <w:tcW w:w="1595" w:type="dxa"/>
+          </w:tcPr>
+          <w:p>
             <w:r>
               <w:t>Spotahome</w:t>
             </w:r>
-            <w:proofErr w:type="spellEnd"/>
-          </w:p>
-        </w:tc>
-        <w:tc>
-          <w:tcPr>
-            <w:tcW w:w="1648" w:type="dxa"/>
+          </w:p>
+        </w:tc>
+        <w:tc>
+          <w:tcPr>
+            <w:tcW w:w="1703" w:type="dxa"/>
           </w:tcPr>
           <w:p>
             <w:r>
@@ -819,7 +708,7 @@
         </w:tc>
         <w:tc>
           <w:tcPr>
-            <w:tcW w:w="1536" w:type="dxa"/>
+            <w:tcW w:w="1587" w:type="dxa"/>
           </w:tcPr>
           <w:p>
             <w:r>
@@ -829,7 +718,7 @@
         </w:tc>
         <w:tc>
           <w:tcPr>
-            <w:tcW w:w="1596" w:type="dxa"/>
+            <w:tcW w:w="1649" w:type="dxa"/>
           </w:tcPr>
           <w:p>
             <w:r>
@@ -839,17 +728,7 @@
         </w:tc>
         <w:tc>
           <w:tcPr>
-            <w:tcW w:w="1336" w:type="dxa"/>
-          </w:tcPr>
-          <w:p>
-            <w:r>
-              <w:t xml:space="preserve">Ninguno </w:t>
-            </w:r>
-          </w:p>
-        </w:tc>
-        <w:tc>
-          <w:tcPr>
-            <w:tcW w:w="833" w:type="dxa"/>
+            <w:tcW w:w="857" w:type="dxa"/>
           </w:tcPr>
           <w:p>
             <w:r>
@@ -861,19 +740,17 @@
       <w:tr>
         <w:tc>
           <w:tcPr>
-            <w:tcW w:w="1545" w:type="dxa"/>
-          </w:tcPr>
-          <w:p>
-            <w:proofErr w:type="spellStart"/>
+            <w:tcW w:w="1595" w:type="dxa"/>
+          </w:tcPr>
+          <w:p>
             <w:r>
               <w:t>Housfy</w:t>
             </w:r>
-            <w:proofErr w:type="spellEnd"/>
-          </w:p>
-        </w:tc>
-        <w:tc>
-          <w:tcPr>
-            <w:tcW w:w="1648" w:type="dxa"/>
+          </w:p>
+        </w:tc>
+        <w:tc>
+          <w:tcPr>
+            <w:tcW w:w="1703" w:type="dxa"/>
           </w:tcPr>
           <w:p>
             <w:r>
@@ -883,48 +760,49 @@
         </w:tc>
         <w:tc>
           <w:tcPr>
-            <w:tcW w:w="1536" w:type="dxa"/>
-          </w:tcPr>
-          <w:p/>
-        </w:tc>
-        <w:tc>
-          <w:tcPr>
-            <w:tcW w:w="1596" w:type="dxa"/>
-          </w:tcPr>
-          <w:p/>
-        </w:tc>
-        <w:tc>
-          <w:tcPr>
-            <w:tcW w:w="1336" w:type="dxa"/>
-          </w:tcPr>
-          <w:p/>
-        </w:tc>
-        <w:tc>
-          <w:tcPr>
-            <w:tcW w:w="833" w:type="dxa"/>
-          </w:tcPr>
-          <w:p/>
+            <w:tcW w:w="1587" w:type="dxa"/>
+          </w:tcPr>
+          <w:p>
+            <w:r>
+              <w:t>Combina herramientas digitales avanzadas con asesoramiento de inmobiliaria</w:t>
+            </w:r>
+          </w:p>
+        </w:tc>
+        <w:tc>
+          <w:tcPr>
+            <w:tcW w:w="1649" w:type="dxa"/>
+          </w:tcPr>
+          <w:p>
+            <w:r>
+              <w:t>Búsqueda convencional</w:t>
+            </w:r>
+          </w:p>
+        </w:tc>
+        <w:tc>
+          <w:tcPr>
+            <w:tcW w:w="857" w:type="dxa"/>
+          </w:tcPr>
+          <w:p>
+            <w:r>
+              <w:t>Medio</w:t>
+            </w:r>
+          </w:p>
         </w:tc>
       </w:tr>
       <w:tr>
         <w:tc>
           <w:tcPr>
-            <w:tcW w:w="1545" w:type="dxa"/>
-          </w:tcPr>
-          <w:p>
-            <w:proofErr w:type="spellStart"/>
-            <w:r>
-              <w:t>Uniplaces</w:t>
-            </w:r>
-            <w:proofErr w:type="spellEnd"/>
-            <w:r>
-              <w:t xml:space="preserve"> </w:t>
-            </w:r>
-          </w:p>
-        </w:tc>
-        <w:tc>
-          <w:tcPr>
-            <w:tcW w:w="1648" w:type="dxa"/>
+            <w:tcW w:w="1595" w:type="dxa"/>
+          </w:tcPr>
+          <w:p>
+            <w:r>
+              <w:t xml:space="preserve">Uniplaces </w:t>
+            </w:r>
+          </w:p>
+        </w:tc>
+        <w:tc>
+          <w:tcPr>
+            <w:tcW w:w="1703" w:type="dxa"/>
           </w:tcPr>
           <w:p>
             <w:r>
@@ -934,25 +812,27 @@
         </w:tc>
         <w:tc>
           <w:tcPr>
-            <w:tcW w:w="1536" w:type="dxa"/>
-          </w:tcPr>
-          <w:p/>
-        </w:tc>
-        <w:tc>
-          <w:tcPr>
-            <w:tcW w:w="1596" w:type="dxa"/>
-          </w:tcPr>
-          <w:p/>
-        </w:tc>
-        <w:tc>
-          <w:tcPr>
-            <w:tcW w:w="1336" w:type="dxa"/>
-          </w:tcPr>
-          <w:p/>
-        </w:tc>
-        <w:tc>
-          <w:tcPr>
-            <w:tcW w:w="833" w:type="dxa"/>
+            <w:tcW w:w="1587" w:type="dxa"/>
+          </w:tcPr>
+          <w:p>
+            <w:r>
+              <w:t>Dedicado a alquiler de estudiantes</w:t>
+            </w:r>
+          </w:p>
+        </w:tc>
+        <w:tc>
+          <w:tcPr>
+            <w:tcW w:w="1649" w:type="dxa"/>
+          </w:tcPr>
+          <w:p>
+            <w:r>
+              <w:t>Búsqueda convencional con la posibilidad de buscar por universidad</w:t>
+            </w:r>
+          </w:p>
+        </w:tc>
+        <w:tc>
+          <w:tcPr>
+            <w:tcW w:w="857" w:type="dxa"/>
           </w:tcPr>
           <w:p>
             <w:r>
@@ -964,7 +844,7 @@
       <w:tr>
         <w:tc>
           <w:tcPr>
-            <w:tcW w:w="1545" w:type="dxa"/>
+            <w:tcW w:w="1595" w:type="dxa"/>
           </w:tcPr>
           <w:p>
             <w:r>
@@ -974,17 +854,20 @@
         </w:tc>
         <w:tc>
           <w:tcPr>
-            <w:tcW w:w="1648" w:type="dxa"/>
+            <w:tcW w:w="1703" w:type="dxa"/>
           </w:tcPr>
           <w:p>
             <w:r>
               <w:t>Compra/venta y alquiler tradicional</w:t>
             </w:r>
-          </w:p>
-        </w:tc>
-        <w:tc>
-          <w:tcPr>
-            <w:tcW w:w="1536" w:type="dxa"/>
+            <w:r>
+              <w:t xml:space="preserve"> (en persona)</w:t>
+            </w:r>
+          </w:p>
+        </w:tc>
+        <w:tc>
+          <w:tcPr>
+            <w:tcW w:w="1587" w:type="dxa"/>
           </w:tcPr>
           <w:p>
             <w:r>
@@ -994,7 +877,7 @@
         </w:tc>
         <w:tc>
           <w:tcPr>
-            <w:tcW w:w="1596" w:type="dxa"/>
+            <w:tcW w:w="1649" w:type="dxa"/>
           </w:tcPr>
           <w:p>
             <w:r>
@@ -1004,17 +887,7 @@
         </w:tc>
         <w:tc>
           <w:tcPr>
-            <w:tcW w:w="1336" w:type="dxa"/>
-          </w:tcPr>
-          <w:p>
-            <w:r>
-              <w:t>Ninguno (?)</w:t>
-            </w:r>
-          </w:p>
-        </w:tc>
-        <w:tc>
-          <w:tcPr>
-            <w:tcW w:w="833" w:type="dxa"/>
+            <w:tcW w:w="857" w:type="dxa"/>
           </w:tcPr>
           <w:p>
             <w:r>
@@ -1026,32 +899,30 @@
       <w:tr>
         <w:tc>
           <w:tcPr>
-            <w:tcW w:w="1545" w:type="dxa"/>
-          </w:tcPr>
-          <w:p>
-            <w:proofErr w:type="spellStart"/>
-            <w:r>
-              <w:t>Redpiso</w:t>
-            </w:r>
-            <w:proofErr w:type="spellEnd"/>
-            <w:r>
-              <w:t xml:space="preserve"> </w:t>
-            </w:r>
-          </w:p>
-        </w:tc>
-        <w:tc>
-          <w:tcPr>
-            <w:tcW w:w="1648" w:type="dxa"/>
+            <w:tcW w:w="1595" w:type="dxa"/>
+          </w:tcPr>
+          <w:p>
+            <w:r>
+              <w:t xml:space="preserve">Redpiso </w:t>
+            </w:r>
+          </w:p>
+        </w:tc>
+        <w:tc>
+          <w:tcPr>
+            <w:tcW w:w="1703" w:type="dxa"/>
           </w:tcPr>
           <w:p>
             <w:r>
               <w:t>Compra/venta y alquiler tradicional</w:t>
             </w:r>
-          </w:p>
-        </w:tc>
-        <w:tc>
-          <w:tcPr>
-            <w:tcW w:w="1536" w:type="dxa"/>
+            <w:r>
+              <w:t xml:space="preserve"> (en persona)</w:t>
+            </w:r>
+          </w:p>
+        </w:tc>
+        <w:tc>
+          <w:tcPr>
+            <w:tcW w:w="1587" w:type="dxa"/>
           </w:tcPr>
           <w:p>
             <w:r>
@@ -1061,7 +932,7 @@
         </w:tc>
         <w:tc>
           <w:tcPr>
-            <w:tcW w:w="1596" w:type="dxa"/>
+            <w:tcW w:w="1649" w:type="dxa"/>
           </w:tcPr>
           <w:p>
             <w:r>
@@ -1071,17 +942,7 @@
         </w:tc>
         <w:tc>
           <w:tcPr>
-            <w:tcW w:w="1336" w:type="dxa"/>
-          </w:tcPr>
-          <w:p>
-            <w:r>
-              <w:t>Ninguno (?)</w:t>
-            </w:r>
-          </w:p>
-        </w:tc>
-        <w:tc>
-          <w:tcPr>
-            <w:tcW w:w="833" w:type="dxa"/>
+            <w:tcW w:w="857" w:type="dxa"/>
           </w:tcPr>
           <w:p>
             <w:r>
@@ -1092,6 +953,466 @@
       </w:tr>
     </w:tbl>
     <w:p/>
+    <w:p>
+      <w:pPr>
+        <w:pStyle w:val="Ttulo1"/>
+      </w:pPr>
+      <w:r>
+        <w:lastRenderedPageBreak/>
+        <w:t>Por qué realizo este proyecto</w:t>
+      </w:r>
+    </w:p>
+    <w:p>
+      <w:pPr>
+        <w:jc w:val="both"/>
+      </w:pPr>
+      <w:r>
+        <w:t xml:space="preserve">El motivo principal por el que se realiza este proyecto es por tratar de facilitar la búsqueda de viviendas para todo aquel interesado, especialmente gente joven que esté tratando de compartir piso con gente desconocida. </w:t>
+      </w:r>
+    </w:p>
+    <w:p>
+      <w:pPr>
+        <w:jc w:val="both"/>
+      </w:pPr>
+      <w:r>
+        <w:t>Esta aplicación puede no ser tan útil para mucha gente que busque piso en una ciudad donde conozcan a mucha gente, donde el simple anuncio mediante otras redes sociales como Instagram o X puede servirle para encontrar algo. No obstante, esta aplicación podría sustituir la necesidad de anunciar este tipo de cosas por otros medios, haciéndolo por un</w:t>
+      </w:r>
+      <w:r>
+        <w:t>o</w:t>
+      </w:r>
+      <w:r>
+        <w:t xml:space="preserve"> dedicado exclusivamente a est</w:t>
+      </w:r>
+      <w:r>
+        <w:t>e fin</w:t>
+      </w:r>
+      <w:r>
+        <w:t xml:space="preserve">. </w:t>
+      </w:r>
+    </w:p>
+    <w:p>
+      <w:pPr>
+        <w:jc w:val="both"/>
+      </w:pPr>
+      <w:r>
+        <w:t xml:space="preserve">Es, además, especialmente útil para la gente que busque compartir piso en zonas o ciudades </w:t>
+      </w:r>
+      <w:r>
+        <w:t>a las que</w:t>
+      </w:r>
+      <w:r>
+        <w:t xml:space="preserve"> acaben de llegar o simplemente no conozcan gente allí; así como aquella gente que busque una vivienda para entrar ellos solos (o con su familia) de manera fiable, segura y perdiendo el mínimo tiempo posible.</w:t>
+      </w:r>
+    </w:p>
+    <w:p>
+      <w:pPr>
+        <w:jc w:val="both"/>
+      </w:pPr>
+      <w:r>
+        <w:t xml:space="preserve">Hay muchas plataformas disponibles, como se ha visto a lo largo de este documento, cada una con sus puntos fuertes. Sin embargo, el objetivo de esta aplicación sería juntar todas las características clave para una persona en búsqueda de vivienda o de compañeros, de la forma más cómoda y fiable, facilitando </w:t>
+      </w:r>
+      <w:r>
+        <w:t xml:space="preserve">lo máximo posible </w:t>
+      </w:r>
+      <w:r>
+        <w:t xml:space="preserve">un proceso que normalmente puede </w:t>
+      </w:r>
+      <w:r>
+        <w:t>resultar</w:t>
+      </w:r>
+      <w:r>
+        <w:t xml:space="preserve"> tedioso</w:t>
+      </w:r>
+      <w:r>
+        <w:t>.</w:t>
+      </w:r>
+    </w:p>
+    <w:p>
+      <w:pPr>
+        <w:jc w:val="both"/>
+      </w:pPr>
+      <w:r>
+        <w:t>El control de anuncios de viviendas, junto con los requisitos impuestos a los mismos, harán que todos los anuncios representen claramente cómo es la vivienda, evitando anuncios falsos, engañosos y garantizando que se pueda encontrar la mejor opción disponible</w:t>
+      </w:r>
+      <w:r>
+        <w:t>, evitando visitas, entrevistas, etc. que, de haberlo sabido previamente, se habrían considerado directamente innecesarias.</w:t>
+      </w:r>
+    </w:p>
+    <w:p>
+      <w:pPr>
+        <w:jc w:val="both"/>
+      </w:pPr>
+      <w:r>
+        <w:t xml:space="preserve">Además, se tratará de facilitar </w:t>
+      </w:r>
+      <w:r>
+        <w:t>en la mayor medida</w:t>
+      </w:r>
+      <w:r>
+        <w:t xml:space="preserve"> la búsqueda de compañeros con los que convivir, garantizando que siempre se pueda encontrar a aquella persona que, sobre el papel, más se pued</w:t>
+      </w:r>
+      <w:r>
+        <w:t>a</w:t>
+      </w:r>
+      <w:r>
+        <w:t xml:space="preserve"> asemejar a uno mismo, buscando la mejor convivencia posible. El objetivo de la aplicación no es que se encuentre al compañero con la mejor valoración de todos los aspectos de la convivencia, ya que esos aspectos quizá no se asemejen a lo que </w:t>
+      </w:r>
+      <w:r>
+        <w:t xml:space="preserve">la </w:t>
+      </w:r>
+      <w:r>
+        <w:t>otra persona busca, si no en encontrar a la persona o personas que mejor se ajusten a la otra</w:t>
+      </w:r>
+      <w:r>
+        <w:t>, sin la necesidad de perder tiempo innecesario en el proceso.</w:t>
+      </w:r>
+    </w:p>
+    <w:p>
+      <w:pPr>
+        <w:jc w:val="both"/>
+      </w:pPr>
+      <w:r>
+        <w:t>La idea de este proyecto surge durante mi etapa de búsqueda de compañeros de piso a lo largo de la carrera</w:t>
+      </w:r>
+      <w:r>
+        <w:t>;</w:t>
+      </w:r>
+      <w:r>
+        <w:t xml:space="preserve"> </w:t>
+      </w:r>
+      <w:r>
+        <w:t>apareciendo</w:t>
+      </w:r>
+      <w:r>
+        <w:t xml:space="preserve"> complicaciones a la hora de encontrar gente o a la hora de convivir debido a la incompatibilidad de unas personas con otras, generando un malestar general en la convivencia de la vivienda</w:t>
+      </w:r>
+      <w:r>
+        <w:t>, debido a diversos factores</w:t>
+      </w:r>
+      <w:r>
+        <w:t>;</w:t>
+      </w:r>
+      <w:r>
+        <w:t xml:space="preserve"> </w:t>
+      </w:r>
+      <w:r>
+        <w:t>a</w:t>
+      </w:r>
+      <w:r>
+        <w:t xml:space="preserve">sí como en la búsqueda de piso en sí, con anuncios poco claros que, una vez visitada la vivienda, parece obvio </w:t>
+      </w:r>
+      <w:r>
+        <w:t>que,</w:t>
+      </w:r>
+      <w:r>
+        <w:t xml:space="preserve"> si el anuncio hubiera </w:t>
+      </w:r>
+      <w:r>
+        <w:lastRenderedPageBreak/>
+        <w:t>representado de manera correcta la estancia</w:t>
+      </w:r>
+      <w:r>
+        <w:t xml:space="preserve">, no habría </w:t>
+      </w:r>
+      <w:r>
+        <w:t>sido</w:t>
+      </w:r>
+      <w:r>
+        <w:t xml:space="preserve"> necesaria visita alguna.</w:t>
+      </w:r>
+    </w:p>
+    <w:p>
+      <w:pPr>
+        <w:pStyle w:val="Ttulo1"/>
+      </w:pPr>
+      <w:r>
+        <w:t xml:space="preserve">Bibliografía </w:t>
+      </w:r>
+    </w:p>
+    <w:p>
+      <w:r>
+        <w:t>Información sobre las herramientas de búsqueda de piso más usadas en España:</w:t>
+      </w:r>
+    </w:p>
+    <w:p>
+      <w:pPr>
+        <w:pStyle w:val="Prrafodelista"/>
+        <w:numPr>
+          <w:ilvl w:val="0"/>
+          <w:numId w:val="4"/>
+        </w:numPr>
+      </w:pPr>
+      <w:hyperlink r:id="rId5" w:history="1">
+        <w:r>
+          <w:rPr>
+            <w:rStyle w:val="Hipervnculo"/>
+          </w:rPr>
+          <w:t>https://marketing4ecommerce.net/mejores-apps-webs-para-buscar-piso-online/</w:t>
+        </w:r>
+      </w:hyperlink>
+      <w:r>
+        <w:t xml:space="preserve"> </w:t>
+      </w:r>
+    </w:p>
+    <w:p>
+      <w:pPr>
+        <w:pStyle w:val="Prrafodelista"/>
+        <w:numPr>
+          <w:ilvl w:val="0"/>
+          <w:numId w:val="4"/>
+        </w:numPr>
+      </w:pPr>
+      <w:hyperlink r:id="rId6" w:history="1">
+        <w:r>
+          <w:rPr>
+            <w:rStyle w:val="Hipervnculo"/>
+          </w:rPr>
+          <w:t>https://www.eleconomista.es/tecnologia/noticias/13078890/11/24/adios-a-idealista-fotocasa-y-pisoscom-estas-son-las-mejores-apps-para-encontrar-piso.html</w:t>
+        </w:r>
+      </w:hyperlink>
+      <w:r>
+        <w:t xml:space="preserve"> </w:t>
+      </w:r>
+    </w:p>
+    <w:p>
+      <w:pPr>
+        <w:pStyle w:val="Prrafodelista"/>
+        <w:numPr>
+          <w:ilvl w:val="0"/>
+          <w:numId w:val="4"/>
+        </w:numPr>
+      </w:pPr>
+      <w:hyperlink r:id="rId7" w:history="1">
+        <w:r>
+          <w:rPr>
+            <w:rStyle w:val="Hipervnculo"/>
+          </w:rPr>
+          <w:t>https://gemini.google.com/</w:t>
+        </w:r>
+      </w:hyperlink>
+      <w:r>
+        <w:t xml:space="preserve"> </w:t>
+      </w:r>
+    </w:p>
+    <w:p>
+      <w:r>
+        <w:t>Información acerca de cada una de las herramientas mencionadas:</w:t>
+      </w:r>
+    </w:p>
+    <w:p>
+      <w:pPr>
+        <w:pStyle w:val="Prrafodelista"/>
+        <w:numPr>
+          <w:ilvl w:val="0"/>
+          <w:numId w:val="3"/>
+        </w:numPr>
+      </w:pPr>
+      <w:hyperlink r:id="rId8" w:history="1">
+        <w:r>
+          <w:rPr>
+            <w:rStyle w:val="Hipervnculo"/>
+          </w:rPr>
+          <w:t>https://www.idealista.com/</w:t>
+        </w:r>
+      </w:hyperlink>
+      <w:r>
+        <w:t xml:space="preserve"> </w:t>
+      </w:r>
+    </w:p>
+    <w:p>
+      <w:pPr>
+        <w:pStyle w:val="Prrafodelista"/>
+        <w:numPr>
+          <w:ilvl w:val="0"/>
+          <w:numId w:val="3"/>
+        </w:numPr>
+      </w:pPr>
+      <w:hyperlink r:id="rId9" w:history="1">
+        <w:r>
+          <w:rPr>
+            <w:rStyle w:val="Hipervnculo"/>
+          </w:rPr>
+          <w:t>https://www.fotocasa.es/es/</w:t>
+        </w:r>
+      </w:hyperlink>
+    </w:p>
+    <w:p>
+      <w:pPr>
+        <w:pStyle w:val="Prrafodelista"/>
+        <w:numPr>
+          <w:ilvl w:val="0"/>
+          <w:numId w:val="3"/>
+        </w:numPr>
+      </w:pPr>
+      <w:hyperlink r:id="rId10" w:history="1">
+        <w:r>
+          <w:rPr>
+            <w:rStyle w:val="Hipervnculo"/>
+          </w:rPr>
+          <w:t>https://www.habitaclia.com/</w:t>
+        </w:r>
+      </w:hyperlink>
+      <w:r>
+        <w:t xml:space="preserve"> </w:t>
+      </w:r>
+    </w:p>
+    <w:p>
+      <w:pPr>
+        <w:pStyle w:val="Prrafodelista"/>
+        <w:numPr>
+          <w:ilvl w:val="0"/>
+          <w:numId w:val="3"/>
+        </w:numPr>
+      </w:pPr>
+      <w:hyperlink r:id="rId11" w:history="1">
+        <w:r>
+          <w:rPr>
+            <w:rStyle w:val="Hipervnculo"/>
+          </w:rPr>
+          <w:t>https://pisos.com/</w:t>
+        </w:r>
+      </w:hyperlink>
+      <w:r>
+        <w:t xml:space="preserve"> </w:t>
+      </w:r>
+      <w:r>
+        <w:t xml:space="preserve"> </w:t>
+      </w:r>
+    </w:p>
+    <w:p>
+      <w:pPr>
+        <w:pStyle w:val="Prrafodelista"/>
+        <w:numPr>
+          <w:ilvl w:val="0"/>
+          <w:numId w:val="3"/>
+        </w:numPr>
+      </w:pPr>
+      <w:hyperlink r:id="rId12" w:history="1">
+        <w:r>
+          <w:rPr>
+            <w:rStyle w:val="Hipervnculo"/>
+          </w:rPr>
+          <w:t>https://www.yaencontre.com/</w:t>
+        </w:r>
+      </w:hyperlink>
+    </w:p>
+    <w:p>
+      <w:pPr>
+        <w:pStyle w:val="Prrafodelista"/>
+        <w:numPr>
+          <w:ilvl w:val="0"/>
+          <w:numId w:val="3"/>
+        </w:numPr>
+      </w:pPr>
+      <w:hyperlink r:id="rId13" w:history="1">
+        <w:r>
+          <w:rPr>
+            <w:rStyle w:val="Hipervnculo"/>
+          </w:rPr>
+          <w:t>https://badi.com/es/</w:t>
+        </w:r>
+      </w:hyperlink>
+      <w:r>
+        <w:t xml:space="preserve"> </w:t>
+      </w:r>
+    </w:p>
+    <w:p>
+      <w:pPr>
+        <w:pStyle w:val="Prrafodelista"/>
+        <w:numPr>
+          <w:ilvl w:val="0"/>
+          <w:numId w:val="3"/>
+        </w:numPr>
+      </w:pPr>
+      <w:hyperlink r:id="rId14" w:history="1">
+        <w:r>
+          <w:rPr>
+            <w:rStyle w:val="Hipervnculo"/>
+          </w:rPr>
+          <w:t>https://www.spotahome.com/es</w:t>
+        </w:r>
+      </w:hyperlink>
+      <w:r>
+        <w:t xml:space="preserve"> </w:t>
+      </w:r>
+    </w:p>
+    <w:p>
+      <w:pPr>
+        <w:pStyle w:val="Prrafodelista"/>
+        <w:numPr>
+          <w:ilvl w:val="0"/>
+          <w:numId w:val="3"/>
+        </w:numPr>
+      </w:pPr>
+      <w:hyperlink r:id="rId15" w:history="1">
+        <w:r>
+          <w:rPr>
+            <w:rStyle w:val="Hipervnculo"/>
+          </w:rPr>
+          <w:t>https://housfy.com/</w:t>
+        </w:r>
+      </w:hyperlink>
+      <w:r>
+        <w:t xml:space="preserve"> </w:t>
+      </w:r>
+    </w:p>
+    <w:p>
+      <w:pPr>
+        <w:pStyle w:val="Prrafodelista"/>
+        <w:numPr>
+          <w:ilvl w:val="0"/>
+          <w:numId w:val="3"/>
+        </w:numPr>
+      </w:pPr>
+      <w:hyperlink r:id="rId16" w:history="1">
+        <w:r>
+          <w:rPr>
+            <w:rStyle w:val="Hipervnculo"/>
+          </w:rPr>
+          <w:t>https://www.uniplaces.com/es</w:t>
+        </w:r>
+      </w:hyperlink>
+      <w:r>
+        <w:t xml:space="preserve"> </w:t>
+      </w:r>
+    </w:p>
+    <w:p>
+      <w:pPr>
+        <w:pStyle w:val="Prrafodelista"/>
+        <w:numPr>
+          <w:ilvl w:val="0"/>
+          <w:numId w:val="3"/>
+        </w:numPr>
+      </w:pPr>
+      <w:hyperlink r:id="rId17" w:history="1">
+        <w:r>
+          <w:rPr>
+            <w:rStyle w:val="Hipervnculo"/>
+          </w:rPr>
+          <w:t>https://www.tecnocasa.es/</w:t>
+        </w:r>
+      </w:hyperlink>
+    </w:p>
+    <w:p>
+      <w:pPr>
+        <w:pStyle w:val="Prrafodelista"/>
+        <w:numPr>
+          <w:ilvl w:val="0"/>
+          <w:numId w:val="3"/>
+        </w:numPr>
+      </w:pPr>
+      <w:hyperlink r:id="rId18" w:history="1">
+        <w:r>
+          <w:rPr>
+            <w:rStyle w:val="Hipervnculo"/>
+          </w:rPr>
+          <w:t>https://www.redpiso.es/</w:t>
+        </w:r>
+      </w:hyperlink>
+      <w:r>
+        <w:t xml:space="preserve"> </w:t>
+      </w:r>
+    </w:p>
     <w:sectPr>
       <w:pgSz w:w="11906" w:h="16838"/>
       <w:pgMar w:top="1417" w:right="1701" w:bottom="1417" w:left="1701" w:header="708" w:footer="708" w:gutter="0"/>
@@ -1105,6 +1426,118 @@
 <file path=word/numbering.xml><?xml version="1.0" encoding="utf-8"?>
 <w:numbering xmlns:wpc="http://schemas.microsoft.com/office/word/2010/wordprocessingCanvas" xmlns:cx="http://schemas.microsoft.com/office/drawing/2014/chartex" xmlns:cx1="http://schemas.microsoft.com/office/drawing/2015/9/8/chartex" xmlns:cx2="http://schemas.microsoft.com/office/drawing/2015/10/21/chartex" xmlns:cx3="http://schemas.microsoft.com/office/drawing/2016/5/9/chartex" xmlns:cx4="http://schemas.microsoft.com/office/drawing/2016/5/10/chartex" xmlns:cx5="http://schemas.microsoft.com/office/drawing/2016/5/11/chartex" xmlns:cx6="http://schemas.microsoft.com/office/drawing/2016/5/12/chartex" xmlns:cx7="http://schemas.microsoft.com/office/drawing/2016/5/13/chartex" xmlns:cx8="http://schemas.microsoft.com/office/drawing/2016/5/14/chartex" xmlns:mc="http://schemas.openxmlformats.org/markup-compatibility/2006" xmlns:aink="http://schemas.microsoft.com/office/drawing/2016/ink" xmlns:am3d="http://schemas.microsoft.com/office/drawing/2017/model3d" xmlns:o="urn:schemas-microsoft-com:office:office" xmlns:oel="http://schemas.microsoft.com/office/2019/extlst" xmlns:r="http://schemas.openxmlformats.org/officeDocument/2006/relationships" xmlns:m="http://schemas.openxmlformats.org/officeDocument/2006/math" xmlns:v="urn:schemas-microsoft-com:vml" xmlns:wp14="http://schemas.microsoft.com/office/word/2010/wordprocessingDrawing" xmlns:wp="http://schemas.openxmlformats.org/drawingml/2006/wordprocessingDrawing" xmlns:w10="urn:schemas-microsoft-com:office:word" xmlns:w="http://schemas.openxmlformats.org/wordprocessingml/2006/main" xmlns:w14="http://schemas.microsoft.com/office/word/2010/wordml" xmlns:w15="http://schemas.microsoft.com/office/word/2012/wordml" xmlns:w16cex="http://schemas.microsoft.com/office/word/2018/wordml/cex" xmlns:w16cid="http://schemas.microsoft.com/office/word/2016/wordml/cid" xmlns:w16="http://schemas.microsoft.com/office/word/2018/wordml" xmlns:w16du="http://schemas.microsoft.com/office/word/2023/wordml/word16du" xmlns:w16sdtdh="http://schemas.microsoft.com/office/word/2020/wordml/sdtdatahash" xmlns:w16sdtfl="http://schemas.microsoft.com/office/word/2024/wordml/sdtformatlock" xmlns:w16se="http://schemas.microsoft.com/office/word/2015/wordml/symex" xmlns:wpg="http://schemas.microsoft.com/office/word/2010/wordprocessingGroup" xmlns:wpi="http://schemas.microsoft.com/office/word/2010/wordprocessingInk" xmlns:wne="http://schemas.microsoft.com/office/word/2006/wordml" xmlns:wps="http://schemas.microsoft.com/office/word/2010/wordprocessingShape" mc:Ignorable="w14 w15 w16se w16cid w16 w16cex w16sdtdh w16sdtfl w16du wp14">
   <w:abstractNum w:abstractNumId="0" w15:restartNumberingAfterBreak="0">
+    <w:nsid w:val="074B79AB"/>
+    <w:multiLevelType w:val="hybridMultilevel"/>
+    <w:tmpl w:val="35D0FE7C"/>
+    <w:lvl w:ilvl="0" w:tplc="B5ECCE6A">
+      <w:numFmt w:val="bullet"/>
+      <w:lvlText w:val="-"/>
+      <w:lvlJc w:val="left"/>
+      <w:pPr>
+        <w:ind w:left="720" w:hanging="360"/>
+      </w:pPr>
+      <w:rPr>
+        <w:rFonts w:ascii="Aptos" w:eastAsiaTheme="minorHAnsi" w:hAnsi="Aptos" w:cstheme="minorBidi" w:hint="default"/>
+      </w:rPr>
+    </w:lvl>
+    <w:lvl w:ilvl="1" w:tplc="0C0A0003" w:tentative="1">
+      <w:start w:val="1"/>
+      <w:numFmt w:val="bullet"/>
+      <w:lvlText w:val="o"/>
+      <w:lvlJc w:val="left"/>
+      <w:pPr>
+        <w:ind w:left="1440" w:hanging="360"/>
+      </w:pPr>
+      <w:rPr>
+        <w:rFonts w:ascii="Courier New" w:hAnsi="Courier New" w:cs="Courier New" w:hint="default"/>
+      </w:rPr>
+    </w:lvl>
+    <w:lvl w:ilvl="2" w:tplc="0C0A0005" w:tentative="1">
+      <w:start w:val="1"/>
+      <w:numFmt w:val="bullet"/>
+      <w:lvlText w:val=""/>
+      <w:lvlJc w:val="left"/>
+      <w:pPr>
+        <w:ind w:left="2160" w:hanging="360"/>
+      </w:pPr>
+      <w:rPr>
+        <w:rFonts w:ascii="Wingdings" w:hAnsi="Wingdings" w:hint="default"/>
+      </w:rPr>
+    </w:lvl>
+    <w:lvl w:ilvl="3" w:tplc="0C0A0001" w:tentative="1">
+      <w:start w:val="1"/>
+      <w:numFmt w:val="bullet"/>
+      <w:lvlText w:val=""/>
+      <w:lvlJc w:val="left"/>
+      <w:pPr>
+        <w:ind w:left="2880" w:hanging="360"/>
+      </w:pPr>
+      <w:rPr>
+        <w:rFonts w:ascii="Symbol" w:hAnsi="Symbol" w:hint="default"/>
+      </w:rPr>
+    </w:lvl>
+    <w:lvl w:ilvl="4" w:tplc="0C0A0003" w:tentative="1">
+      <w:start w:val="1"/>
+      <w:numFmt w:val="bullet"/>
+      <w:lvlText w:val="o"/>
+      <w:lvlJc w:val="left"/>
+      <w:pPr>
+        <w:ind w:left="3600" w:hanging="360"/>
+      </w:pPr>
+      <w:rPr>
+        <w:rFonts w:ascii="Courier New" w:hAnsi="Courier New" w:cs="Courier New" w:hint="default"/>
+      </w:rPr>
+    </w:lvl>
+    <w:lvl w:ilvl="5" w:tplc="0C0A0005" w:tentative="1">
+      <w:start w:val="1"/>
+      <w:numFmt w:val="bullet"/>
+      <w:lvlText w:val=""/>
+      <w:lvlJc w:val="left"/>
+      <w:pPr>
+        <w:ind w:left="4320" w:hanging="360"/>
+      </w:pPr>
+      <w:rPr>
+        <w:rFonts w:ascii="Wingdings" w:hAnsi="Wingdings" w:hint="default"/>
+      </w:rPr>
+    </w:lvl>
+    <w:lvl w:ilvl="6" w:tplc="0C0A0001" w:tentative="1">
+      <w:start w:val="1"/>
+      <w:numFmt w:val="bullet"/>
+      <w:lvlText w:val=""/>
+      <w:lvlJc w:val="left"/>
+      <w:pPr>
+        <w:ind w:left="5040" w:hanging="360"/>
+      </w:pPr>
+      <w:rPr>
+        <w:rFonts w:ascii="Symbol" w:hAnsi="Symbol" w:hint="default"/>
+      </w:rPr>
+    </w:lvl>
+    <w:lvl w:ilvl="7" w:tplc="0C0A0003" w:tentative="1">
+      <w:start w:val="1"/>
+      <w:numFmt w:val="bullet"/>
+      <w:lvlText w:val="o"/>
+      <w:lvlJc w:val="left"/>
+      <w:pPr>
+        <w:ind w:left="5760" w:hanging="360"/>
+      </w:pPr>
+      <w:rPr>
+        <w:rFonts w:ascii="Courier New" w:hAnsi="Courier New" w:cs="Courier New" w:hint="default"/>
+      </w:rPr>
+    </w:lvl>
+    <w:lvl w:ilvl="8" w:tplc="0C0A0005" w:tentative="1">
+      <w:start w:val="1"/>
+      <w:numFmt w:val="bullet"/>
+      <w:lvlText w:val=""/>
+      <w:lvlJc w:val="left"/>
+      <w:pPr>
+        <w:ind w:left="6480" w:hanging="360"/>
+      </w:pPr>
+      <w:rPr>
+        <w:rFonts w:ascii="Wingdings" w:hAnsi="Wingdings" w:hint="default"/>
+      </w:rPr>
+    </w:lvl>
+  </w:abstractNum>
+  <w:abstractNum w:abstractNumId="1" w15:restartNumberingAfterBreak="0">
     <w:nsid w:val="20F63A40"/>
     <w:multiLevelType w:val="hybridMultilevel"/>
     <w:tmpl w:val="DF6E28A2"/>
@@ -1216,7 +1649,119 @@
       </w:rPr>
     </w:lvl>
   </w:abstractNum>
-  <w:abstractNum w:abstractNumId="1" w15:restartNumberingAfterBreak="0">
+  <w:abstractNum w:abstractNumId="2" w15:restartNumberingAfterBreak="0">
+    <w:nsid w:val="322A2239"/>
+    <w:multiLevelType w:val="hybridMultilevel"/>
+    <w:tmpl w:val="A5321102"/>
+    <w:lvl w:ilvl="0" w:tplc="10CCA566">
+      <w:numFmt w:val="bullet"/>
+      <w:lvlText w:val="-"/>
+      <w:lvlJc w:val="left"/>
+      <w:pPr>
+        <w:ind w:left="720" w:hanging="360"/>
+      </w:pPr>
+      <w:rPr>
+        <w:rFonts w:ascii="Aptos" w:eastAsiaTheme="minorHAnsi" w:hAnsi="Aptos" w:cstheme="minorBidi" w:hint="default"/>
+      </w:rPr>
+    </w:lvl>
+    <w:lvl w:ilvl="1" w:tplc="0C0A0003" w:tentative="1">
+      <w:start w:val="1"/>
+      <w:numFmt w:val="bullet"/>
+      <w:lvlText w:val="o"/>
+      <w:lvlJc w:val="left"/>
+      <w:pPr>
+        <w:ind w:left="1440" w:hanging="360"/>
+      </w:pPr>
+      <w:rPr>
+        <w:rFonts w:ascii="Courier New" w:hAnsi="Courier New" w:cs="Courier New" w:hint="default"/>
+      </w:rPr>
+    </w:lvl>
+    <w:lvl w:ilvl="2" w:tplc="0C0A0005" w:tentative="1">
+      <w:start w:val="1"/>
+      <w:numFmt w:val="bullet"/>
+      <w:lvlText w:val=""/>
+      <w:lvlJc w:val="left"/>
+      <w:pPr>
+        <w:ind w:left="2160" w:hanging="360"/>
+      </w:pPr>
+      <w:rPr>
+        <w:rFonts w:ascii="Wingdings" w:hAnsi="Wingdings" w:hint="default"/>
+      </w:rPr>
+    </w:lvl>
+    <w:lvl w:ilvl="3" w:tplc="0C0A0001" w:tentative="1">
+      <w:start w:val="1"/>
+      <w:numFmt w:val="bullet"/>
+      <w:lvlText w:val=""/>
+      <w:lvlJc w:val="left"/>
+      <w:pPr>
+        <w:ind w:left="2880" w:hanging="360"/>
+      </w:pPr>
+      <w:rPr>
+        <w:rFonts w:ascii="Symbol" w:hAnsi="Symbol" w:hint="default"/>
+      </w:rPr>
+    </w:lvl>
+    <w:lvl w:ilvl="4" w:tplc="0C0A0003" w:tentative="1">
+      <w:start w:val="1"/>
+      <w:numFmt w:val="bullet"/>
+      <w:lvlText w:val="o"/>
+      <w:lvlJc w:val="left"/>
+      <w:pPr>
+        <w:ind w:left="3600" w:hanging="360"/>
+      </w:pPr>
+      <w:rPr>
+        <w:rFonts w:ascii="Courier New" w:hAnsi="Courier New" w:cs="Courier New" w:hint="default"/>
+      </w:rPr>
+    </w:lvl>
+    <w:lvl w:ilvl="5" w:tplc="0C0A0005" w:tentative="1">
+      <w:start w:val="1"/>
+      <w:numFmt w:val="bullet"/>
+      <w:lvlText w:val=""/>
+      <w:lvlJc w:val="left"/>
+      <w:pPr>
+        <w:ind w:left="4320" w:hanging="360"/>
+      </w:pPr>
+      <w:rPr>
+        <w:rFonts w:ascii="Wingdings" w:hAnsi="Wingdings" w:hint="default"/>
+      </w:rPr>
+    </w:lvl>
+    <w:lvl w:ilvl="6" w:tplc="0C0A0001" w:tentative="1">
+      <w:start w:val="1"/>
+      <w:numFmt w:val="bullet"/>
+      <w:lvlText w:val=""/>
+      <w:lvlJc w:val="left"/>
+      <w:pPr>
+        <w:ind w:left="5040" w:hanging="360"/>
+      </w:pPr>
+      <w:rPr>
+        <w:rFonts w:ascii="Symbol" w:hAnsi="Symbol" w:hint="default"/>
+      </w:rPr>
+    </w:lvl>
+    <w:lvl w:ilvl="7" w:tplc="0C0A0003" w:tentative="1">
+      <w:start w:val="1"/>
+      <w:numFmt w:val="bullet"/>
+      <w:lvlText w:val="o"/>
+      <w:lvlJc w:val="left"/>
+      <w:pPr>
+        <w:ind w:left="5760" w:hanging="360"/>
+      </w:pPr>
+      <w:rPr>
+        <w:rFonts w:ascii="Courier New" w:hAnsi="Courier New" w:cs="Courier New" w:hint="default"/>
+      </w:rPr>
+    </w:lvl>
+    <w:lvl w:ilvl="8" w:tplc="0C0A0005" w:tentative="1">
+      <w:start w:val="1"/>
+      <w:numFmt w:val="bullet"/>
+      <w:lvlText w:val=""/>
+      <w:lvlJc w:val="left"/>
+      <w:pPr>
+        <w:ind w:left="6480" w:hanging="360"/>
+      </w:pPr>
+      <w:rPr>
+        <w:rFonts w:ascii="Wingdings" w:hAnsi="Wingdings" w:hint="default"/>
+      </w:rPr>
+    </w:lvl>
+  </w:abstractNum>
+  <w:abstractNum w:abstractNumId="3" w15:restartNumberingAfterBreak="0">
     <w:nsid w:val="63DD5B9D"/>
     <w:multiLevelType w:val="hybridMultilevel"/>
     <w:tmpl w:val="53DA4500"/>
@@ -1329,9 +1874,15 @@
     </w:lvl>
   </w:abstractNum>
   <w:num w:numId="1" w16cid:durableId="2047293722">
+    <w:abstractNumId w:val="3"/>
+  </w:num>
+  <w:num w:numId="2" w16cid:durableId="136068280">
     <w:abstractNumId w:val="1"/>
   </w:num>
-  <w:num w:numId="2" w16cid:durableId="136068280">
+  <w:num w:numId="3" w16cid:durableId="2035810947">
+    <w:abstractNumId w:val="2"/>
+  </w:num>
+  <w:num w:numId="4" w16cid:durableId="1148984240">
     <w:abstractNumId w:val="0"/>
   </w:num>
 </w:numbering>
@@ -1745,7 +2296,7 @@
     <w:link w:val="Ttulo1Car"/>
     <w:uiPriority w:val="9"/>
     <w:qFormat/>
-    <w:rsid w:val="00985FC1"/>
+    <w:rsid w:val="006A6D7B"/>
     <w:pPr>
       <w:keepNext/>
       <w:keepLines/>
@@ -1754,7 +2305,6 @@
     </w:pPr>
     <w:rPr>
       <w:rFonts w:asciiTheme="majorHAnsi" w:eastAsiaTheme="majorEastAsia" w:hAnsiTheme="majorHAnsi" w:cstheme="majorBidi"/>
-      <w:color w:val="0F4761" w:themeColor="accent1" w:themeShade="BF"/>
       <w:sz w:val="40"/>
       <w:szCs w:val="40"/>
     </w:rPr>
@@ -1767,16 +2317,16 @@
     <w:uiPriority w:val="9"/>
     <w:unhideWhenUsed/>
     <w:qFormat/>
-    <w:rsid w:val="00985FC1"/>
+    <w:rsid w:val="006A6D7B"/>
     <w:pPr>
       <w:keepNext/>
       <w:keepLines/>
       <w:spacing w:before="160" w:after="80"/>
+      <w:ind w:firstLine="708"/>
       <w:outlineLvl w:val="1"/>
     </w:pPr>
     <w:rPr>
       <w:rFonts w:asciiTheme="majorHAnsi" w:eastAsiaTheme="majorEastAsia" w:hAnsiTheme="majorHAnsi" w:cstheme="majorBidi"/>
-      <w:color w:val="0F4761" w:themeColor="accent1" w:themeShade="BF"/>
       <w:sz w:val="32"/>
       <w:szCs w:val="32"/>
     </w:rPr>
@@ -1968,10 +2518,9 @@
     <w:basedOn w:val="Fuentedeprrafopredeter"/>
     <w:link w:val="Ttulo1"/>
     <w:uiPriority w:val="9"/>
-    <w:rsid w:val="00985FC1"/>
+    <w:rsid w:val="006A6D7B"/>
     <w:rPr>
       <w:rFonts w:asciiTheme="majorHAnsi" w:eastAsiaTheme="majorEastAsia" w:hAnsiTheme="majorHAnsi" w:cstheme="majorBidi"/>
-      <w:color w:val="0F4761" w:themeColor="accent1" w:themeShade="BF"/>
       <w:sz w:val="40"/>
       <w:szCs w:val="40"/>
     </w:rPr>
@@ -1981,10 +2530,9 @@
     <w:basedOn w:val="Fuentedeprrafopredeter"/>
     <w:link w:val="Ttulo2"/>
     <w:uiPriority w:val="9"/>
-    <w:rsid w:val="00985FC1"/>
+    <w:rsid w:val="006A6D7B"/>
     <w:rPr>
       <w:rFonts w:asciiTheme="majorHAnsi" w:eastAsiaTheme="majorEastAsia" w:hAnsiTheme="majorHAnsi" w:cstheme="majorBidi"/>
-      <w:color w:val="0F4761" w:themeColor="accent1" w:themeShade="BF"/>
       <w:sz w:val="32"/>
       <w:szCs w:val="32"/>
     </w:rPr>
@@ -2269,6 +2817,29 @@
         <w:insideV w:val="single" w:sz="4" w:space="0" w:color="auto"/>
       </w:tblBorders>
     </w:tblPr>
+  </w:style>
+  <w:style w:type="character" w:styleId="Hipervnculo">
+    <w:name w:val="Hyperlink"/>
+    <w:basedOn w:val="Fuentedeprrafopredeter"/>
+    <w:uiPriority w:val="99"/>
+    <w:unhideWhenUsed/>
+    <w:rsid w:val="00684995"/>
+    <w:rPr>
+      <w:color w:val="467886" w:themeColor="hyperlink"/>
+      <w:u w:val="single"/>
+    </w:rPr>
+  </w:style>
+  <w:style w:type="character" w:styleId="Mencinsinresolver">
+    <w:name w:val="Unresolved Mention"/>
+    <w:basedOn w:val="Fuentedeprrafopredeter"/>
+    <w:uiPriority w:val="99"/>
+    <w:semiHidden/>
+    <w:unhideWhenUsed/>
+    <w:rsid w:val="00684995"/>
+    <w:rPr>
+      <w:color w:val="605E5C"/>
+      <w:shd w:val="clear" w:color="auto" w:fill="E1DFDD"/>
+    </w:rPr>
   </w:style>
 </w:styles>
 </file>

</xml_diff>